<commit_message>
docs: remove Laya section (4.9) and mentions; drop ConvAI reference
</commit_message>
<xml_diff>
--- a/docs/thesis-ch1.docx
+++ b/docs/thesis-ch1.docx
@@ -446,7 +446,7 @@
           <w:b w:val="0"/>
           <w:sz w:val="24"/>
         </w:rPr>
-        <w:t xml:space="preserve"> 基于标签词的 logit 提取大模型的类别概率，计算期望校准误差（ECE）并绘制可靠性图，检验温度缩放的效果；绘制覆盖率—准确率曲线，比较各模型的 AURC；并用保形预测给出有覆盖率保证的预测集合。此外，评估了开源决策模型 Laya 的零样本表现。</w:t>
+        <w:t xml:space="preserve"> 基于标签词的 logit 提取大模型的类别概率，计算期望校准误差（ECE）并绘制可靠性图，检验温度缩放的效果；绘制覆盖率—准确率曲线，比较各模型的 AURC；并用保形预测给出有覆盖率保证的预测集合。</w:t>
       </w:r>
     </w:p>
     <w:p>
@@ -736,7 +736,7 @@
           <w:b w:val="0"/>
           <w:sz w:val="24"/>
         </w:rPr>
-        <w:t>第 4 章为实验结果与分析，报告各模型的性能比较、统计检验、校准与选择性预测、消融实验、数据泄漏与标注噪声分析、保形预测以及开源决策模型的结果。</w:t>
+        <w:t>第 4 章为实验结果与分析，报告各模型的性能比较、统计检验、校准与选择性预测、消融实验、数据泄漏与标注噪声分析以及保形预测的结果。</w:t>
       </w:r>
     </w:p>
     <w:p>

</xml_diff>